<commit_message>
Fix P1R-05 fidelity script for Round 5
</commit_message>
<xml_diff>
--- a/data/raw/word/Bộ-luật-10-2012-QH13.docx
+++ b/data/raw/word/Bộ-luật-10-2012-QH13.docx
@@ -36583,7 +36583,7 @@
         <mc:AlternateContent>
           <mc:Choice Requires="wps">
             <w:drawing>
-              <wp:anchor distT="0" distB="0" distL="114300" distR="114300" simplePos="0" relativeHeight="251657728" behindDoc="0" locked="0" layoutInCell="1" allowOverlap="1" wp14:anchorId="65998358" wp14:editId="126FCAC1">
+              <wp:anchor distT="0" distB="0" distL="114300" distR="114300" simplePos="0" relativeHeight="251657728" behindDoc="0" locked="0" layoutInCell="1" allowOverlap="1" wp14:anchorId="53D8DC50" wp14:editId="1A065110">
                 <wp:simplePos x="0" y="0"/>
                 <wp:positionH relativeFrom="column">
                   <wp:posOffset>50800</wp:posOffset>
@@ -36594,7 +36594,7 @@
                 <wp:extent cx="5867400" cy="0"/>
                 <wp:effectExtent l="12700" t="8255" r="6350" b="10795"/>
                 <wp:wrapNone/>
-                <wp:docPr id="930456244" name="Line 4"/>
+                <wp:docPr id="2018237533" name="Line 4"/>
                 <wp:cNvGraphicFramePr>
                   <a:graphicFrameLocks xmlns:a="http://schemas.openxmlformats.org/drawingml/2006/main"/>
                 </wp:cNvGraphicFramePr>
@@ -36644,7 +36644,7 @@
           </mc:Choice>
           <mc:Fallback>
             <w:pict>
-              <v:line w14:anchorId="57DFD7CF" id="Line 4" o:spid="_x0000_s1026" style="position:absolute;z-index:251657728;visibility:visible;mso-wrap-style:square;mso-width-percent:0;mso-height-percent:0;mso-wrap-distance-left:9pt;mso-wrap-distance-top:0;mso-wrap-distance-right:9pt;mso-wrap-distance-bottom:0;mso-position-horizontal:absolute;mso-position-horizontal-relative:text;mso-position-vertical:absolute;mso-position-vertical-relative:text;mso-width-percent:0;mso-height-percent:0;mso-width-relative:page;mso-height-relative:page" from="4pt,.4pt" to="466pt,.4pt" o:gfxdata="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"/>
+              <v:line w14:anchorId="3F38BF27" id="Line 4" o:spid="_x0000_s1026" style="position:absolute;z-index:251657728;visibility:visible;mso-wrap-style:square;mso-width-percent:0;mso-height-percent:0;mso-wrap-distance-left:9pt;mso-wrap-distance-top:0;mso-wrap-distance-right:9pt;mso-wrap-distance-bottom:0;mso-position-horizontal:absolute;mso-position-horizontal-relative:text;mso-position-vertical:absolute;mso-position-vertical-relative:text;mso-width-percent:0;mso-height-percent:0;mso-width-relative:page;mso-height-relative:page" from="4pt,.4pt" to="466pt,.4pt" o:gfxdata="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"/>
             </w:pict>
           </mc:Fallback>
         </mc:AlternateContent>
@@ -36931,7 +36931,7 @@
         <w:noProof/>
       </w:rPr>
       <w:drawing>
-        <wp:inline distT="0" distB="0" distL="0" distR="0" wp14:anchorId="5A70A26D" wp14:editId="152670A5">
+        <wp:inline distT="0" distB="0" distL="0" distR="0" wp14:anchorId="7483133F" wp14:editId="0C783137">
           <wp:extent cx="5867400" cy="819150"/>
           <wp:effectExtent l="0" t="0" r="0" b="0"/>
           <wp:docPr id="2" name="Picture 1"/>
@@ -37019,7 +37019,7 @@
         <w:noProof/>
       </w:rPr>
       <w:drawing>
-        <wp:inline distT="0" distB="0" distL="0" distR="0" wp14:anchorId="7710CC0A" wp14:editId="7F8CAAB9">
+        <wp:inline distT="0" distB="0" distL="0" distR="0" wp14:anchorId="00CA85FE" wp14:editId="2395E3DB">
           <wp:extent cx="6086475" cy="771525"/>
           <wp:effectExtent l="0" t="0" r="0" b="0"/>
           <wp:docPr id="1" name="Picture 2" descr="C:\Documents and Settings\User\Desktop\Hien-2.jpg"/>
@@ -39295,61 +39295,61 @@
       </w:rPr>
     </w:lvl>
   </w:abstractNum>
-  <w:num w:numId="1" w16cid:durableId="2030134591">
+  <w:num w:numId="1" w16cid:durableId="1247349307">
     <w:abstractNumId w:val="8"/>
   </w:num>
-  <w:num w:numId="2" w16cid:durableId="1994944278">
+  <w:num w:numId="2" w16cid:durableId="589508009">
     <w:abstractNumId w:val="11"/>
   </w:num>
-  <w:num w:numId="3" w16cid:durableId="1844977000">
+  <w:num w:numId="3" w16cid:durableId="1989747262">
     <w:abstractNumId w:val="3"/>
   </w:num>
-  <w:num w:numId="4" w16cid:durableId="1363553870">
+  <w:num w:numId="4" w16cid:durableId="1270240523">
     <w:abstractNumId w:val="13"/>
   </w:num>
-  <w:num w:numId="5" w16cid:durableId="395394725">
+  <w:num w:numId="5" w16cid:durableId="1257516372">
     <w:abstractNumId w:val="0"/>
   </w:num>
-  <w:num w:numId="6" w16cid:durableId="45305259">
+  <w:num w:numId="6" w16cid:durableId="702680531">
     <w:abstractNumId w:val="7"/>
   </w:num>
-  <w:num w:numId="7" w16cid:durableId="1634167783">
+  <w:num w:numId="7" w16cid:durableId="2029604026">
     <w:abstractNumId w:val="14"/>
   </w:num>
-  <w:num w:numId="8" w16cid:durableId="1376268439">
+  <w:num w:numId="8" w16cid:durableId="924067685">
     <w:abstractNumId w:val="15"/>
   </w:num>
-  <w:num w:numId="9" w16cid:durableId="1338774725">
+  <w:num w:numId="9" w16cid:durableId="256141537">
     <w:abstractNumId w:val="1"/>
   </w:num>
-  <w:num w:numId="10" w16cid:durableId="136458466">
+  <w:num w:numId="10" w16cid:durableId="1222791749">
     <w:abstractNumId w:val="6"/>
   </w:num>
-  <w:num w:numId="11" w16cid:durableId="113453438">
+  <w:num w:numId="11" w16cid:durableId="1432167155">
     <w:abstractNumId w:val="18"/>
   </w:num>
-  <w:num w:numId="12" w16cid:durableId="1906066105">
+  <w:num w:numId="12" w16cid:durableId="2098361154">
     <w:abstractNumId w:val="17"/>
   </w:num>
-  <w:num w:numId="13" w16cid:durableId="1719163925">
+  <w:num w:numId="13" w16cid:durableId="92436608">
     <w:abstractNumId w:val="4"/>
   </w:num>
-  <w:num w:numId="14" w16cid:durableId="1650286145">
+  <w:num w:numId="14" w16cid:durableId="575700242">
     <w:abstractNumId w:val="5"/>
   </w:num>
-  <w:num w:numId="15" w16cid:durableId="895167014">
+  <w:num w:numId="15" w16cid:durableId="35549837">
     <w:abstractNumId w:val="16"/>
   </w:num>
-  <w:num w:numId="16" w16cid:durableId="581334329">
+  <w:num w:numId="16" w16cid:durableId="1763186793">
     <w:abstractNumId w:val="9"/>
   </w:num>
-  <w:num w:numId="17" w16cid:durableId="1815490462">
+  <w:num w:numId="17" w16cid:durableId="955672116">
     <w:abstractNumId w:val="10"/>
   </w:num>
-  <w:num w:numId="18" w16cid:durableId="1852330600">
+  <w:num w:numId="18" w16cid:durableId="869614000">
     <w:abstractNumId w:val="12"/>
   </w:num>
-  <w:num w:numId="19" w16cid:durableId="812337074">
+  <w:num w:numId="19" w16cid:durableId="1050687563">
     <w:abstractNumId w:val="2"/>
   </w:num>
 </w:numbering>

</xml_diff>